<commit_message>
docs: English screenshots in the EN manual + regenerated PDFs (DE/EN)
- WithEase-Manual-EN.docx: embed English UI screenshots (rendered from the
  app in English) in place of the German ones
- Regenerate WithEase-Anleitung.pdf and WithEase-Manual-EN.pdf from the docx

Co-Authored-By: Claude Opus 4.8 <noreply@anthropic.com>
</commit_message>
<xml_diff>
--- a/docs/WithEase-Manual-EN.docx
+++ b/docs/WithEase-Manual-EN.docx
@@ -792,7 +792,7 @@
         <w:rPr/>
         <w:drawing>
           <wp:inline distT="0" distB="0" distL="0" distR="0">
-            <wp:extent cx="5579745" cy="2615565"/>
+            <wp:extent cx="5579745" cy="4443130"/>
             <wp:effectExtent l="0" t="0" r="0" b="0"/>
             <wp:docPr id="2" name="Picture 2"/>
             <wp:cNvGraphicFramePr>
@@ -816,7 +816,7 @@
                   <pic:spPr bwMode="auto">
                     <a:xfrm>
                       <a:off x="0" y="0"/>
-                      <a:ext cx="5579745" cy="2615565"/>
+                      <a:ext cx="5579745" cy="4443130"/>
                     </a:xfrm>
                     <a:prstGeom prst="rect">
                       <a:avLst/>
@@ -1293,7 +1293,7 @@
         <w:rPr/>
         <w:drawing>
           <wp:inline distT="0" distB="0" distL="0" distR="0">
-            <wp:extent cx="5579745" cy="3382645"/>
+            <wp:extent cx="5579745" cy="4443130"/>
             <wp:effectExtent l="0" t="0" r="0" b="0"/>
             <wp:docPr id="3" name="Picture 3"/>
             <wp:cNvGraphicFramePr>
@@ -1317,7 +1317,7 @@
                   <pic:spPr bwMode="auto">
                     <a:xfrm>
                       <a:off x="0" y="0"/>
-                      <a:ext cx="5579745" cy="3382645"/>
+                      <a:ext cx="5579745" cy="4443130"/>
                     </a:xfrm>
                     <a:prstGeom prst="rect">
                       <a:avLst/>
@@ -1505,7 +1505,7 @@
         <w:rPr/>
         <w:drawing>
           <wp:inline distT="0" distB="0" distL="0" distR="0">
-            <wp:extent cx="5579745" cy="4362450"/>
+            <wp:extent cx="5579745" cy="4443130"/>
             <wp:effectExtent l="0" t="0" r="0" b="0"/>
             <wp:docPr id="4" name="Picture 4"/>
             <wp:cNvGraphicFramePr>
@@ -1529,7 +1529,7 @@
                   <pic:spPr bwMode="auto">
                     <a:xfrm>
                       <a:off x="0" y="0"/>
-                      <a:ext cx="5579745" cy="4362450"/>
+                      <a:ext cx="5579745" cy="4443130"/>
                     </a:xfrm>
                     <a:prstGeom prst="rect">
                       <a:avLst/>
@@ -1661,7 +1661,7 @@
         <w:rPr/>
         <w:drawing>
           <wp:inline distT="0" distB="0" distL="0" distR="0">
-            <wp:extent cx="5579745" cy="3435985"/>
+            <wp:extent cx="5579745" cy="4443130"/>
             <wp:effectExtent l="0" t="0" r="0" b="0"/>
             <wp:docPr id="5" name="Picture 5"/>
             <wp:cNvGraphicFramePr>
@@ -1685,7 +1685,7 @@
                   <pic:spPr bwMode="auto">
                     <a:xfrm>
                       <a:off x="0" y="0"/>
-                      <a:ext cx="5579745" cy="3435985"/>
+                      <a:ext cx="5579745" cy="4443130"/>
                     </a:xfrm>
                     <a:prstGeom prst="rect">
                       <a:avLst/>
@@ -1973,7 +1973,7 @@
         <w:rPr/>
         <w:drawing>
           <wp:inline distT="0" distB="0" distL="0" distR="0">
-            <wp:extent cx="4140200" cy="3103245"/>
+            <wp:extent cx="4140200" cy="3344007"/>
             <wp:effectExtent l="0" t="0" r="0" b="0"/>
             <wp:docPr id="6" name="Picture 6"/>
             <wp:cNvGraphicFramePr>
@@ -1997,7 +1997,7 @@
                   <pic:spPr bwMode="auto">
                     <a:xfrm>
                       <a:off x="0" y="0"/>
-                      <a:ext cx="4140200" cy="3103245"/>
+                      <a:ext cx="4140200" cy="3344007"/>
                     </a:xfrm>
                     <a:prstGeom prst="rect">
                       <a:avLst/>
@@ -2197,7 +2197,7 @@
         <w:rPr/>
         <w:drawing>
           <wp:inline distT="0" distB="0" distL="0" distR="0">
-            <wp:extent cx="5579745" cy="3112770"/>
+            <wp:extent cx="5579745" cy="4443130"/>
             <wp:effectExtent l="0" t="0" r="0" b="0"/>
             <wp:docPr id="7" name="Picture 7"/>
             <wp:cNvGraphicFramePr>
@@ -2221,7 +2221,7 @@
                   <pic:spPr bwMode="auto">
                     <a:xfrm>
                       <a:off x="0" y="0"/>
-                      <a:ext cx="5579745" cy="3112770"/>
+                      <a:ext cx="5579745" cy="4443130"/>
                     </a:xfrm>
                     <a:prstGeom prst="rect">
                       <a:avLst/>
@@ -2325,7 +2325,7 @@
         <w:rPr/>
         <w:drawing>
           <wp:inline distT="0" distB="0" distL="0" distR="0">
-            <wp:extent cx="5579745" cy="3515360"/>
+            <wp:extent cx="5579745" cy="4443130"/>
             <wp:effectExtent l="0" t="0" r="0" b="0"/>
             <wp:docPr id="8" name="Picture 8"/>
             <wp:cNvGraphicFramePr>
@@ -2349,7 +2349,7 @@
                   <pic:spPr bwMode="auto">
                     <a:xfrm>
                       <a:off x="0" y="0"/>
-                      <a:ext cx="5579745" cy="3515360"/>
+                      <a:ext cx="5579745" cy="4443130"/>
                     </a:xfrm>
                     <a:prstGeom prst="rect">
                       <a:avLst/>
@@ -2453,7 +2453,7 @@
         <w:rPr/>
         <w:drawing>
           <wp:inline distT="0" distB="0" distL="0" distR="0">
-            <wp:extent cx="5579745" cy="2652395"/>
+            <wp:extent cx="5579745" cy="4443130"/>
             <wp:effectExtent l="0" t="0" r="0" b="0"/>
             <wp:docPr id="9" name="Picture 9"/>
             <wp:cNvGraphicFramePr>
@@ -2477,7 +2477,7 @@
                   <pic:spPr bwMode="auto">
                     <a:xfrm>
                       <a:off x="0" y="0"/>
-                      <a:ext cx="5579745" cy="2652395"/>
+                      <a:ext cx="5579745" cy="4443130"/>
                     </a:xfrm>
                     <a:prstGeom prst="rect">
                       <a:avLst/>
@@ -3206,7 +3206,7 @@
         <w:rPr/>
         <w:drawing>
           <wp:inline distT="0" distB="0" distL="0" distR="0">
-            <wp:extent cx="5579745" cy="4546600"/>
+            <wp:extent cx="5579745" cy="4443130"/>
             <wp:effectExtent l="0" t="0" r="0" b="0"/>
             <wp:docPr id="10" name="Picture 10"/>
             <wp:cNvGraphicFramePr>
@@ -3230,7 +3230,7 @@
                   <pic:spPr bwMode="auto">
                     <a:xfrm>
                       <a:off x="0" y="0"/>
-                      <a:ext cx="5579745" cy="4546600"/>
+                      <a:ext cx="5579745" cy="4443130"/>
                     </a:xfrm>
                     <a:prstGeom prst="rect">
                       <a:avLst/>

</xml_diff>